<commit_message>
Agrega el costo en pesos y el sobreconsumo a los perfiles de Weir.
Las barras marcan el exceso del período punta y la segunda página compara el costo a tarifa normal con el recargo. Baquedano 1215 queda revisado como medidor de control.

Co-authored-by: anibaloperacionesWes <anibaloperacionesWes@users.noreply.github.com>
</commit_message>
<xml_diff>
--- a/reports/Weir/Perfil_consumo/weir Almirante Riveros.docx
+++ b/reports/Weir/Perfil_consumo/weir Almirante Riveros.docx
@@ -251,13 +251,35 @@
           </w:p>
         </w:tc>
       </w:tr>
+      <w:tr>
+        <w:tc>
+          <w:tcPr>
+            <w:tcW w:type="dxa" w:w="4320"/>
+          </w:tcPr>
+          <w:p>
+            <w:r>
+              <w:t>Límite de sobreconsumo</w:t>
+            </w:r>
+          </w:p>
+        </w:tc>
+        <w:tc>
+          <w:tcPr>
+            <w:tcW w:type="dxa" w:w="4320"/>
+          </w:tcPr>
+          <w:p>
+            <w:r>
+              <w:t>253 m³/mes</w:t>
+            </w:r>
+          </w:p>
+        </w:tc>
+      </w:tr>
     </w:tbl>
     <w:p/>
     <w:p>
       <w:r>
         <w:drawing>
           <wp:inline xmlns:a="http://schemas.openxmlformats.org/drawingml/2006/main" xmlns:pic="http://schemas.openxmlformats.org/drawingml/2006/picture">
-            <wp:extent cx="5852160" cy="2027976"/>
+            <wp:extent cx="5852160" cy="1999005"/>
             <wp:docPr id="1" name="Picture 1"/>
             <wp:cNvGraphicFramePr>
               <a:graphicFrameLocks noChangeAspect="1"/>
@@ -278,7 +300,7 @@
                   <pic:spPr>
                     <a:xfrm>
                       <a:off x="0" y="0"/>
-                      <a:ext cx="5852160" cy="2027976"/>
+                      <a:ext cx="5852160" cy="1999005"/>
                     </a:xfrm>
                     <a:prstGeom prst="rect"/>
                   </pic:spPr>
@@ -290,11 +312,13 @@
       </w:r>
     </w:p>
     <w:p>
-      <w:pPr>
-        <w:jc w:val="left"/>
-      </w:pPr>
       <w:r>
         <w:t>Últimos 12 meses (oct-25 a sep-26): 3.036 m³ · promedio 253 m³/mes · máximo 253 m³ (Sep-25) · mínimo 253 m³ (Sep-25).</w:t>
+      </w:r>
+    </w:p>
+    <w:p>
+      <w:r>
+        <w:t>En los cinco meses punta el costo a tarifa normal sería $ 1.748.120 y con sobreconsumo queda en $ 1.748.120. La diferencia es $ 0 (0 m³ sobre el límite de 253 m³, a $1.131,92 más por m³ de agua potable).</w:t>
       </w:r>
     </w:p>
     <w:p>
@@ -302,7 +326,7 @@
         <w:pStyle w:val="Heading2"/>
       </w:pPr>
       <w:r>
-        <w:t>Serie mensual (m³)</w:t>
+        <w:t>Costo normal y costo con sobreconsumo</w:t>
       </w:r>
     </w:p>
     <w:tbl>
@@ -312,24 +336,90 @@
         <w:tblLook w:firstColumn="1" w:firstRow="1" w:lastColumn="0" w:lastRow="0" w:noHBand="0" w:noVBand="1" w:val="04A0"/>
       </w:tblPr>
       <w:tblGrid>
-        <w:gridCol w:w="665"/>
-        <w:gridCol w:w="665"/>
-        <w:gridCol w:w="665"/>
-        <w:gridCol w:w="665"/>
-        <w:gridCol w:w="665"/>
-        <w:gridCol w:w="665"/>
-        <w:gridCol w:w="665"/>
-        <w:gridCol w:w="665"/>
-        <w:gridCol w:w="665"/>
-        <w:gridCol w:w="665"/>
-        <w:gridCol w:w="665"/>
-        <w:gridCol w:w="665"/>
-        <w:gridCol w:w="665"/>
+        <w:gridCol w:w="1234"/>
+        <w:gridCol w:w="1234"/>
+        <w:gridCol w:w="1234"/>
+        <w:gridCol w:w="1234"/>
+        <w:gridCol w:w="1234"/>
+        <w:gridCol w:w="1234"/>
+        <w:gridCol w:w="1234"/>
       </w:tblGrid>
       <w:tr>
         <w:tc>
           <w:tcPr>
-            <w:tcW w:type="dxa" w:w="665"/>
+            <w:tcW w:type="dxa" w:w="1234"/>
+          </w:tcPr>
+          <w:p>
+            <w:r>
+              <w:t>Mes</w:t>
+            </w:r>
+          </w:p>
+        </w:tc>
+        <w:tc>
+          <w:tcPr>
+            <w:tcW w:type="dxa" w:w="1234"/>
+          </w:tcPr>
+          <w:p>
+            <w:r>
+              <w:t>Período</w:t>
+            </w:r>
+          </w:p>
+        </w:tc>
+        <w:tc>
+          <w:tcPr>
+            <w:tcW w:type="dxa" w:w="1234"/>
+          </w:tcPr>
+          <w:p>
+            <w:r>
+              <w:t>m³</w:t>
+            </w:r>
+          </w:p>
+        </w:tc>
+        <w:tc>
+          <w:tcPr>
+            <w:tcW w:type="dxa" w:w="1234"/>
+          </w:tcPr>
+          <w:p>
+            <w:r>
+              <w:t>m³ sobre</w:t>
+            </w:r>
+          </w:p>
+        </w:tc>
+        <w:tc>
+          <w:tcPr>
+            <w:tcW w:type="dxa" w:w="1234"/>
+          </w:tcPr>
+          <w:p>
+            <w:r>
+              <w:t>Costo normal</w:t>
+            </w:r>
+          </w:p>
+        </w:tc>
+        <w:tc>
+          <w:tcPr>
+            <w:tcW w:type="dxa" w:w="1234"/>
+          </w:tcPr>
+          <w:p>
+            <w:r>
+              <w:t>Con sobreconsumo</w:t>
+            </w:r>
+          </w:p>
+        </w:tc>
+        <w:tc>
+          <w:tcPr>
+            <w:tcW w:type="dxa" w:w="1234"/>
+          </w:tcPr>
+          <w:p>
+            <w:r>
+              <w:t>Diferencia</w:t>
+            </w:r>
+          </w:p>
+        </w:tc>
+      </w:tr>
+      <w:tr>
+        <w:tc>
+          <w:tcPr>
+            <w:tcW w:type="dxa" w:w="1234"/>
           </w:tcPr>
           <w:p>
             <w:r>
@@ -339,7 +429,69 @@
         </w:tc>
         <w:tc>
           <w:tcPr>
-            <w:tcW w:type="dxa" w:w="665"/>
+            <w:tcW w:type="dxa" w:w="1234"/>
+          </w:tcPr>
+          <w:p>
+            <w:r>
+              <w:t>No punta</w:t>
+            </w:r>
+          </w:p>
+        </w:tc>
+        <w:tc>
+          <w:tcPr>
+            <w:tcW w:type="dxa" w:w="1234"/>
+          </w:tcPr>
+          <w:p>
+            <w:r>
+              <w:t>253</w:t>
+            </w:r>
+          </w:p>
+        </w:tc>
+        <w:tc>
+          <w:tcPr>
+            <w:tcW w:type="dxa" w:w="1234"/>
+          </w:tcPr>
+          <w:p>
+            <w:r>
+              <w:t>—</w:t>
+            </w:r>
+          </w:p>
+        </w:tc>
+        <w:tc>
+          <w:tcPr>
+            <w:tcW w:type="dxa" w:w="1234"/>
+          </w:tcPr>
+          <w:p>
+            <w:r>
+              <w:t>$ 351.200</w:t>
+            </w:r>
+          </w:p>
+        </w:tc>
+        <w:tc>
+          <w:tcPr>
+            <w:tcW w:type="dxa" w:w="1234"/>
+          </w:tcPr>
+          <w:p>
+            <w:r>
+              <w:t>$ 351.200</w:t>
+            </w:r>
+          </w:p>
+        </w:tc>
+        <w:tc>
+          <w:tcPr>
+            <w:tcW w:type="dxa" w:w="1234"/>
+          </w:tcPr>
+          <w:p>
+            <w:r>
+              <w:t>—</w:t>
+            </w:r>
+          </w:p>
+        </w:tc>
+      </w:tr>
+      <w:tr>
+        <w:tc>
+          <w:tcPr>
+            <w:tcW w:type="dxa" w:w="1234"/>
           </w:tcPr>
           <w:p>
             <w:r>
@@ -349,7 +501,69 @@
         </w:tc>
         <w:tc>
           <w:tcPr>
-            <w:tcW w:type="dxa" w:w="665"/>
+            <w:tcW w:type="dxa" w:w="1234"/>
+          </w:tcPr>
+          <w:p>
+            <w:r>
+              <w:t>No punta</w:t>
+            </w:r>
+          </w:p>
+        </w:tc>
+        <w:tc>
+          <w:tcPr>
+            <w:tcW w:type="dxa" w:w="1234"/>
+          </w:tcPr>
+          <w:p>
+            <w:r>
+              <w:t>253</w:t>
+            </w:r>
+          </w:p>
+        </w:tc>
+        <w:tc>
+          <w:tcPr>
+            <w:tcW w:type="dxa" w:w="1234"/>
+          </w:tcPr>
+          <w:p>
+            <w:r>
+              <w:t>—</w:t>
+            </w:r>
+          </w:p>
+        </w:tc>
+        <w:tc>
+          <w:tcPr>
+            <w:tcW w:type="dxa" w:w="1234"/>
+          </w:tcPr>
+          <w:p>
+            <w:r>
+              <w:t>$ 351.200</w:t>
+            </w:r>
+          </w:p>
+        </w:tc>
+        <w:tc>
+          <w:tcPr>
+            <w:tcW w:type="dxa" w:w="1234"/>
+          </w:tcPr>
+          <w:p>
+            <w:r>
+              <w:t>$ 351.200</w:t>
+            </w:r>
+          </w:p>
+        </w:tc>
+        <w:tc>
+          <w:tcPr>
+            <w:tcW w:type="dxa" w:w="1234"/>
+          </w:tcPr>
+          <w:p>
+            <w:r>
+              <w:t>—</w:t>
+            </w:r>
+          </w:p>
+        </w:tc>
+      </w:tr>
+      <w:tr>
+        <w:tc>
+          <w:tcPr>
+            <w:tcW w:type="dxa" w:w="1234"/>
           </w:tcPr>
           <w:p>
             <w:r>
@@ -359,7 +573,69 @@
         </w:tc>
         <w:tc>
           <w:tcPr>
-            <w:tcW w:type="dxa" w:w="665"/>
+            <w:tcW w:type="dxa" w:w="1234"/>
+          </w:tcPr>
+          <w:p>
+            <w:r>
+              <w:t>No punta</w:t>
+            </w:r>
+          </w:p>
+        </w:tc>
+        <w:tc>
+          <w:tcPr>
+            <w:tcW w:type="dxa" w:w="1234"/>
+          </w:tcPr>
+          <w:p>
+            <w:r>
+              <w:t>253</w:t>
+            </w:r>
+          </w:p>
+        </w:tc>
+        <w:tc>
+          <w:tcPr>
+            <w:tcW w:type="dxa" w:w="1234"/>
+          </w:tcPr>
+          <w:p>
+            <w:r>
+              <w:t>—</w:t>
+            </w:r>
+          </w:p>
+        </w:tc>
+        <w:tc>
+          <w:tcPr>
+            <w:tcW w:type="dxa" w:w="1234"/>
+          </w:tcPr>
+          <w:p>
+            <w:r>
+              <w:t>$ 351.200</w:t>
+            </w:r>
+          </w:p>
+        </w:tc>
+        <w:tc>
+          <w:tcPr>
+            <w:tcW w:type="dxa" w:w="1234"/>
+          </w:tcPr>
+          <w:p>
+            <w:r>
+              <w:t>$ 351.200</w:t>
+            </w:r>
+          </w:p>
+        </w:tc>
+        <w:tc>
+          <w:tcPr>
+            <w:tcW w:type="dxa" w:w="1234"/>
+          </w:tcPr>
+          <w:p>
+            <w:r>
+              <w:t>—</w:t>
+            </w:r>
+          </w:p>
+        </w:tc>
+      </w:tr>
+      <w:tr>
+        <w:tc>
+          <w:tcPr>
+            <w:tcW w:type="dxa" w:w="1234"/>
           </w:tcPr>
           <w:p>
             <w:r>
@@ -369,7 +645,69 @@
         </w:tc>
         <w:tc>
           <w:tcPr>
-            <w:tcW w:type="dxa" w:w="665"/>
+            <w:tcW w:type="dxa" w:w="1234"/>
+          </w:tcPr>
+          <w:p>
+            <w:r>
+              <w:t>No punta</w:t>
+            </w:r>
+          </w:p>
+        </w:tc>
+        <w:tc>
+          <w:tcPr>
+            <w:tcW w:type="dxa" w:w="1234"/>
+          </w:tcPr>
+          <w:p>
+            <w:r>
+              <w:t>253</w:t>
+            </w:r>
+          </w:p>
+        </w:tc>
+        <w:tc>
+          <w:tcPr>
+            <w:tcW w:type="dxa" w:w="1234"/>
+          </w:tcPr>
+          <w:p>
+            <w:r>
+              <w:t>—</w:t>
+            </w:r>
+          </w:p>
+        </w:tc>
+        <w:tc>
+          <w:tcPr>
+            <w:tcW w:type="dxa" w:w="1234"/>
+          </w:tcPr>
+          <w:p>
+            <w:r>
+              <w:t>$ 351.200</w:t>
+            </w:r>
+          </w:p>
+        </w:tc>
+        <w:tc>
+          <w:tcPr>
+            <w:tcW w:type="dxa" w:w="1234"/>
+          </w:tcPr>
+          <w:p>
+            <w:r>
+              <w:t>$ 351.200</w:t>
+            </w:r>
+          </w:p>
+        </w:tc>
+        <w:tc>
+          <w:tcPr>
+            <w:tcW w:type="dxa" w:w="1234"/>
+          </w:tcPr>
+          <w:p>
+            <w:r>
+              <w:t>—</w:t>
+            </w:r>
+          </w:p>
+        </w:tc>
+      </w:tr>
+      <w:tr>
+        <w:tc>
+          <w:tcPr>
+            <w:tcW w:type="dxa" w:w="1234"/>
           </w:tcPr>
           <w:p>
             <w:r>
@@ -379,7 +717,69 @@
         </w:tc>
         <w:tc>
           <w:tcPr>
-            <w:tcW w:type="dxa" w:w="665"/>
+            <w:tcW w:type="dxa" w:w="1234"/>
+          </w:tcPr>
+          <w:p>
+            <w:r>
+              <w:t>Punta</w:t>
+            </w:r>
+          </w:p>
+        </w:tc>
+        <w:tc>
+          <w:tcPr>
+            <w:tcW w:type="dxa" w:w="1234"/>
+          </w:tcPr>
+          <w:p>
+            <w:r>
+              <w:t>253</w:t>
+            </w:r>
+          </w:p>
+        </w:tc>
+        <w:tc>
+          <w:tcPr>
+            <w:tcW w:type="dxa" w:w="1234"/>
+          </w:tcPr>
+          <w:p>
+            <w:r>
+              <w:t>—</w:t>
+            </w:r>
+          </w:p>
+        </w:tc>
+        <w:tc>
+          <w:tcPr>
+            <w:tcW w:type="dxa" w:w="1234"/>
+          </w:tcPr>
+          <w:p>
+            <w:r>
+              <w:t>$ 349.624</w:t>
+            </w:r>
+          </w:p>
+        </w:tc>
+        <w:tc>
+          <w:tcPr>
+            <w:tcW w:type="dxa" w:w="1234"/>
+          </w:tcPr>
+          <w:p>
+            <w:r>
+              <w:t>$ 349.624</w:t>
+            </w:r>
+          </w:p>
+        </w:tc>
+        <w:tc>
+          <w:tcPr>
+            <w:tcW w:type="dxa" w:w="1234"/>
+          </w:tcPr>
+          <w:p>
+            <w:r>
+              <w:t>—</w:t>
+            </w:r>
+          </w:p>
+        </w:tc>
+      </w:tr>
+      <w:tr>
+        <w:tc>
+          <w:tcPr>
+            <w:tcW w:type="dxa" w:w="1234"/>
           </w:tcPr>
           <w:p>
             <w:r>
@@ -389,7 +789,69 @@
         </w:tc>
         <w:tc>
           <w:tcPr>
-            <w:tcW w:type="dxa" w:w="665"/>
+            <w:tcW w:type="dxa" w:w="1234"/>
+          </w:tcPr>
+          <w:p>
+            <w:r>
+              <w:t>Punta</w:t>
+            </w:r>
+          </w:p>
+        </w:tc>
+        <w:tc>
+          <w:tcPr>
+            <w:tcW w:type="dxa" w:w="1234"/>
+          </w:tcPr>
+          <w:p>
+            <w:r>
+              <w:t>253</w:t>
+            </w:r>
+          </w:p>
+        </w:tc>
+        <w:tc>
+          <w:tcPr>
+            <w:tcW w:type="dxa" w:w="1234"/>
+          </w:tcPr>
+          <w:p>
+            <w:r>
+              <w:t>—</w:t>
+            </w:r>
+          </w:p>
+        </w:tc>
+        <w:tc>
+          <w:tcPr>
+            <w:tcW w:type="dxa" w:w="1234"/>
+          </w:tcPr>
+          <w:p>
+            <w:r>
+              <w:t>$ 349.624</w:t>
+            </w:r>
+          </w:p>
+        </w:tc>
+        <w:tc>
+          <w:tcPr>
+            <w:tcW w:type="dxa" w:w="1234"/>
+          </w:tcPr>
+          <w:p>
+            <w:r>
+              <w:t>$ 349.624</w:t>
+            </w:r>
+          </w:p>
+        </w:tc>
+        <w:tc>
+          <w:tcPr>
+            <w:tcW w:type="dxa" w:w="1234"/>
+          </w:tcPr>
+          <w:p>
+            <w:r>
+              <w:t>—</w:t>
+            </w:r>
+          </w:p>
+        </w:tc>
+      </w:tr>
+      <w:tr>
+        <w:tc>
+          <w:tcPr>
+            <w:tcW w:type="dxa" w:w="1234"/>
           </w:tcPr>
           <w:p>
             <w:r>
@@ -399,7 +861,69 @@
         </w:tc>
         <w:tc>
           <w:tcPr>
-            <w:tcW w:type="dxa" w:w="665"/>
+            <w:tcW w:type="dxa" w:w="1234"/>
+          </w:tcPr>
+          <w:p>
+            <w:r>
+              <w:t>Punta</w:t>
+            </w:r>
+          </w:p>
+        </w:tc>
+        <w:tc>
+          <w:tcPr>
+            <w:tcW w:type="dxa" w:w="1234"/>
+          </w:tcPr>
+          <w:p>
+            <w:r>
+              <w:t>253</w:t>
+            </w:r>
+          </w:p>
+        </w:tc>
+        <w:tc>
+          <w:tcPr>
+            <w:tcW w:type="dxa" w:w="1234"/>
+          </w:tcPr>
+          <w:p>
+            <w:r>
+              <w:t>—</w:t>
+            </w:r>
+          </w:p>
+        </w:tc>
+        <w:tc>
+          <w:tcPr>
+            <w:tcW w:type="dxa" w:w="1234"/>
+          </w:tcPr>
+          <w:p>
+            <w:r>
+              <w:t>$ 349.624</w:t>
+            </w:r>
+          </w:p>
+        </w:tc>
+        <w:tc>
+          <w:tcPr>
+            <w:tcW w:type="dxa" w:w="1234"/>
+          </w:tcPr>
+          <w:p>
+            <w:r>
+              <w:t>$ 349.624</w:t>
+            </w:r>
+          </w:p>
+        </w:tc>
+        <w:tc>
+          <w:tcPr>
+            <w:tcW w:type="dxa" w:w="1234"/>
+          </w:tcPr>
+          <w:p>
+            <w:r>
+              <w:t>—</w:t>
+            </w:r>
+          </w:p>
+        </w:tc>
+      </w:tr>
+      <w:tr>
+        <w:tc>
+          <w:tcPr>
+            <w:tcW w:type="dxa" w:w="1234"/>
           </w:tcPr>
           <w:p>
             <w:r>
@@ -409,7 +933,69 @@
         </w:tc>
         <w:tc>
           <w:tcPr>
-            <w:tcW w:type="dxa" w:w="665"/>
+            <w:tcW w:type="dxa" w:w="1234"/>
+          </w:tcPr>
+          <w:p>
+            <w:r>
+              <w:t>Punta</w:t>
+            </w:r>
+          </w:p>
+        </w:tc>
+        <w:tc>
+          <w:tcPr>
+            <w:tcW w:type="dxa" w:w="1234"/>
+          </w:tcPr>
+          <w:p>
+            <w:r>
+              <w:t>253</w:t>
+            </w:r>
+          </w:p>
+        </w:tc>
+        <w:tc>
+          <w:tcPr>
+            <w:tcW w:type="dxa" w:w="1234"/>
+          </w:tcPr>
+          <w:p>
+            <w:r>
+              <w:t>—</w:t>
+            </w:r>
+          </w:p>
+        </w:tc>
+        <w:tc>
+          <w:tcPr>
+            <w:tcW w:type="dxa" w:w="1234"/>
+          </w:tcPr>
+          <w:p>
+            <w:r>
+              <w:t>$ 349.624</w:t>
+            </w:r>
+          </w:p>
+        </w:tc>
+        <w:tc>
+          <w:tcPr>
+            <w:tcW w:type="dxa" w:w="1234"/>
+          </w:tcPr>
+          <w:p>
+            <w:r>
+              <w:t>$ 349.624</w:t>
+            </w:r>
+          </w:p>
+        </w:tc>
+        <w:tc>
+          <w:tcPr>
+            <w:tcW w:type="dxa" w:w="1234"/>
+          </w:tcPr>
+          <w:p>
+            <w:r>
+              <w:t>—</w:t>
+            </w:r>
+          </w:p>
+        </w:tc>
+      </w:tr>
+      <w:tr>
+        <w:tc>
+          <w:tcPr>
+            <w:tcW w:type="dxa" w:w="1234"/>
           </w:tcPr>
           <w:p>
             <w:r>
@@ -419,7 +1005,69 @@
         </w:tc>
         <w:tc>
           <w:tcPr>
-            <w:tcW w:type="dxa" w:w="665"/>
+            <w:tcW w:type="dxa" w:w="1234"/>
+          </w:tcPr>
+          <w:p>
+            <w:r>
+              <w:t>Punta</w:t>
+            </w:r>
+          </w:p>
+        </w:tc>
+        <w:tc>
+          <w:tcPr>
+            <w:tcW w:type="dxa" w:w="1234"/>
+          </w:tcPr>
+          <w:p>
+            <w:r>
+              <w:t>253</w:t>
+            </w:r>
+          </w:p>
+        </w:tc>
+        <w:tc>
+          <w:tcPr>
+            <w:tcW w:type="dxa" w:w="1234"/>
+          </w:tcPr>
+          <w:p>
+            <w:r>
+              <w:t>—</w:t>
+            </w:r>
+          </w:p>
+        </w:tc>
+        <w:tc>
+          <w:tcPr>
+            <w:tcW w:type="dxa" w:w="1234"/>
+          </w:tcPr>
+          <w:p>
+            <w:r>
+              <w:t>$ 349.624</w:t>
+            </w:r>
+          </w:p>
+        </w:tc>
+        <w:tc>
+          <w:tcPr>
+            <w:tcW w:type="dxa" w:w="1234"/>
+          </w:tcPr>
+          <w:p>
+            <w:r>
+              <w:t>$ 349.624</w:t>
+            </w:r>
+          </w:p>
+        </w:tc>
+        <w:tc>
+          <w:tcPr>
+            <w:tcW w:type="dxa" w:w="1234"/>
+          </w:tcPr>
+          <w:p>
+            <w:r>
+              <w:t>—</w:t>
+            </w:r>
+          </w:p>
+        </w:tc>
+      </w:tr>
+      <w:tr>
+        <w:tc>
+          <w:tcPr>
+            <w:tcW w:type="dxa" w:w="1234"/>
           </w:tcPr>
           <w:p>
             <w:r>
@@ -429,7 +1077,69 @@
         </w:tc>
         <w:tc>
           <w:tcPr>
-            <w:tcW w:type="dxa" w:w="665"/>
+            <w:tcW w:type="dxa" w:w="1234"/>
+          </w:tcPr>
+          <w:p>
+            <w:r>
+              <w:t>No punta</w:t>
+            </w:r>
+          </w:p>
+        </w:tc>
+        <w:tc>
+          <w:tcPr>
+            <w:tcW w:type="dxa" w:w="1234"/>
+          </w:tcPr>
+          <w:p>
+            <w:r>
+              <w:t>253</w:t>
+            </w:r>
+          </w:p>
+        </w:tc>
+        <w:tc>
+          <w:tcPr>
+            <w:tcW w:type="dxa" w:w="1234"/>
+          </w:tcPr>
+          <w:p>
+            <w:r>
+              <w:t>—</w:t>
+            </w:r>
+          </w:p>
+        </w:tc>
+        <w:tc>
+          <w:tcPr>
+            <w:tcW w:type="dxa" w:w="1234"/>
+          </w:tcPr>
+          <w:p>
+            <w:r>
+              <w:t>$ 351.200</w:t>
+            </w:r>
+          </w:p>
+        </w:tc>
+        <w:tc>
+          <w:tcPr>
+            <w:tcW w:type="dxa" w:w="1234"/>
+          </w:tcPr>
+          <w:p>
+            <w:r>
+              <w:t>$ 351.200</w:t>
+            </w:r>
+          </w:p>
+        </w:tc>
+        <w:tc>
+          <w:tcPr>
+            <w:tcW w:type="dxa" w:w="1234"/>
+          </w:tcPr>
+          <w:p>
+            <w:r>
+              <w:t>—</w:t>
+            </w:r>
+          </w:p>
+        </w:tc>
+      </w:tr>
+      <w:tr>
+        <w:tc>
+          <w:tcPr>
+            <w:tcW w:type="dxa" w:w="1234"/>
           </w:tcPr>
           <w:p>
             <w:r>
@@ -439,7 +1149,69 @@
         </w:tc>
         <w:tc>
           <w:tcPr>
-            <w:tcW w:type="dxa" w:w="665"/>
+            <w:tcW w:type="dxa" w:w="1234"/>
+          </w:tcPr>
+          <w:p>
+            <w:r>
+              <w:t>No punta</w:t>
+            </w:r>
+          </w:p>
+        </w:tc>
+        <w:tc>
+          <w:tcPr>
+            <w:tcW w:type="dxa" w:w="1234"/>
+          </w:tcPr>
+          <w:p>
+            <w:r>
+              <w:t>253</w:t>
+            </w:r>
+          </w:p>
+        </w:tc>
+        <w:tc>
+          <w:tcPr>
+            <w:tcW w:type="dxa" w:w="1234"/>
+          </w:tcPr>
+          <w:p>
+            <w:r>
+              <w:t>—</w:t>
+            </w:r>
+          </w:p>
+        </w:tc>
+        <w:tc>
+          <w:tcPr>
+            <w:tcW w:type="dxa" w:w="1234"/>
+          </w:tcPr>
+          <w:p>
+            <w:r>
+              <w:t>$ 351.200</w:t>
+            </w:r>
+          </w:p>
+        </w:tc>
+        <w:tc>
+          <w:tcPr>
+            <w:tcW w:type="dxa" w:w="1234"/>
+          </w:tcPr>
+          <w:p>
+            <w:r>
+              <w:t>$ 351.200</w:t>
+            </w:r>
+          </w:p>
+        </w:tc>
+        <w:tc>
+          <w:tcPr>
+            <w:tcW w:type="dxa" w:w="1234"/>
+          </w:tcPr>
+          <w:p>
+            <w:r>
+              <w:t>—</w:t>
+            </w:r>
+          </w:p>
+        </w:tc>
+      </w:tr>
+      <w:tr>
+        <w:tc>
+          <w:tcPr>
+            <w:tcW w:type="dxa" w:w="1234"/>
           </w:tcPr>
           <w:p>
             <w:r>
@@ -449,19 +1221,17 @@
         </w:tc>
         <w:tc>
           <w:tcPr>
-            <w:tcW w:type="dxa" w:w="665"/>
+            <w:tcW w:type="dxa" w:w="1234"/>
           </w:tcPr>
           <w:p>
             <w:r>
-              <w:t>Sep-26</w:t>
+              <w:t>No punta</w:t>
             </w:r>
           </w:p>
         </w:tc>
-      </w:tr>
-      <w:tr>
         <w:tc>
           <w:tcPr>
-            <w:tcW w:type="dxa" w:w="665"/>
+            <w:tcW w:type="dxa" w:w="1234"/>
           </w:tcPr>
           <w:p>
             <w:r>
@@ -471,7 +1241,69 @@
         </w:tc>
         <w:tc>
           <w:tcPr>
-            <w:tcW w:type="dxa" w:w="665"/>
+            <w:tcW w:type="dxa" w:w="1234"/>
+          </w:tcPr>
+          <w:p>
+            <w:r>
+              <w:t>—</w:t>
+            </w:r>
+          </w:p>
+        </w:tc>
+        <w:tc>
+          <w:tcPr>
+            <w:tcW w:type="dxa" w:w="1234"/>
+          </w:tcPr>
+          <w:p>
+            <w:r>
+              <w:t>$ 351.200</w:t>
+            </w:r>
+          </w:p>
+        </w:tc>
+        <w:tc>
+          <w:tcPr>
+            <w:tcW w:type="dxa" w:w="1234"/>
+          </w:tcPr>
+          <w:p>
+            <w:r>
+              <w:t>$ 351.200</w:t>
+            </w:r>
+          </w:p>
+        </w:tc>
+        <w:tc>
+          <w:tcPr>
+            <w:tcW w:type="dxa" w:w="1234"/>
+          </w:tcPr>
+          <w:p>
+            <w:r>
+              <w:t>—</w:t>
+            </w:r>
+          </w:p>
+        </w:tc>
+      </w:tr>
+      <w:tr>
+        <w:tc>
+          <w:tcPr>
+            <w:tcW w:type="dxa" w:w="1234"/>
+          </w:tcPr>
+          <w:p>
+            <w:r>
+              <w:t>Sep-26</w:t>
+            </w:r>
+          </w:p>
+        </w:tc>
+        <w:tc>
+          <w:tcPr>
+            <w:tcW w:type="dxa" w:w="1234"/>
+          </w:tcPr>
+          <w:p>
+            <w:r>
+              <w:t>No punta</w:t>
+            </w:r>
+          </w:p>
+        </w:tc>
+        <w:tc>
+          <w:tcPr>
+            <w:tcW w:type="dxa" w:w="1234"/>
           </w:tcPr>
           <w:p>
             <w:r>
@@ -481,111 +1313,105 @@
         </w:tc>
         <w:tc>
           <w:tcPr>
-            <w:tcW w:type="dxa" w:w="665"/>
+            <w:tcW w:type="dxa" w:w="1234"/>
           </w:tcPr>
           <w:p>
             <w:r>
-              <w:t>253</w:t>
+              <w:t>—</w:t>
             </w:r>
           </w:p>
         </w:tc>
         <w:tc>
           <w:tcPr>
-            <w:tcW w:type="dxa" w:w="665"/>
+            <w:tcW w:type="dxa" w:w="1234"/>
           </w:tcPr>
           <w:p>
             <w:r>
-              <w:t>253</w:t>
+              <w:t>$ 351.200</w:t>
             </w:r>
           </w:p>
         </w:tc>
         <w:tc>
           <w:tcPr>
-            <w:tcW w:type="dxa" w:w="665"/>
+            <w:tcW w:type="dxa" w:w="1234"/>
           </w:tcPr>
           <w:p>
             <w:r>
-              <w:t>253</w:t>
+              <w:t>$ 351.200</w:t>
             </w:r>
           </w:p>
         </w:tc>
         <w:tc>
           <w:tcPr>
-            <w:tcW w:type="dxa" w:w="665"/>
+            <w:tcW w:type="dxa" w:w="1234"/>
           </w:tcPr>
           <w:p>
             <w:r>
-              <w:t>253</w:t>
+              <w:t>—</w:t>
+            </w:r>
+          </w:p>
+        </w:tc>
+      </w:tr>
+      <w:tr>
+        <w:tc>
+          <w:tcPr>
+            <w:tcW w:type="dxa" w:w="1234"/>
+          </w:tcPr>
+          <w:p>
+            <w:r>
+              <w:t>Total</w:t>
             </w:r>
           </w:p>
         </w:tc>
         <w:tc>
           <w:tcPr>
-            <w:tcW w:type="dxa" w:w="665"/>
+            <w:tcW w:type="dxa" w:w="1234"/>
+          </w:tcPr>
+          <w:p/>
+        </w:tc>
+        <w:tc>
+          <w:tcPr>
+            <w:tcW w:type="dxa" w:w="1234"/>
+          </w:tcPr>
+          <w:p/>
+        </w:tc>
+        <w:tc>
+          <w:tcPr>
+            <w:tcW w:type="dxa" w:w="1234"/>
           </w:tcPr>
           <w:p>
             <w:r>
-              <w:t>253</w:t>
+              <w:t>0</w:t>
             </w:r>
           </w:p>
         </w:tc>
         <w:tc>
           <w:tcPr>
-            <w:tcW w:type="dxa" w:w="665"/>
+            <w:tcW w:type="dxa" w:w="1234"/>
           </w:tcPr>
           <w:p>
             <w:r>
-              <w:t>253</w:t>
+              <w:t>$ 4.557.720</w:t>
             </w:r>
           </w:p>
         </w:tc>
         <w:tc>
           <w:tcPr>
-            <w:tcW w:type="dxa" w:w="665"/>
+            <w:tcW w:type="dxa" w:w="1234"/>
           </w:tcPr>
           <w:p>
             <w:r>
-              <w:t>253</w:t>
+              <w:t>$ 4.557.720</w:t>
             </w:r>
           </w:p>
         </w:tc>
         <w:tc>
           <w:tcPr>
-            <w:tcW w:type="dxa" w:w="665"/>
+            <w:tcW w:type="dxa" w:w="1234"/>
           </w:tcPr>
           <w:p>
             <w:r>
-              <w:t>253</w:t>
-            </w:r>
-          </w:p>
-        </w:tc>
-        <w:tc>
-          <w:tcPr>
-            <w:tcW w:type="dxa" w:w="665"/>
-          </w:tcPr>
-          <w:p>
-            <w:r>
-              <w:t>253</w:t>
-            </w:r>
-          </w:p>
-        </w:tc>
-        <w:tc>
-          <w:tcPr>
-            <w:tcW w:type="dxa" w:w="665"/>
-          </w:tcPr>
-          <w:p>
-            <w:r>
-              <w:t>253</w:t>
-            </w:r>
-          </w:p>
-        </w:tc>
-        <w:tc>
-          <w:tcPr>
-            <w:tcW w:type="dxa" w:w="665"/>
-          </w:tcPr>
-          <w:p>
-            <w:r>
-              <w:t>253</w:t>
+              <w:t>$ 0</w:t>
             </w:r>
           </w:p>
         </w:tc>
@@ -615,7 +1441,7 @@
           <w:i/>
           <w:sz w:val="18"/>
         </w:rPr>
-        <w:t>Los meses previos a septiembre 2026 se obtuvieron midiendo el gráfico «Consumo últimos 13 meses» de la boleta emitida el 08-09-2026 y ajustando la escala para que esa última barra coincida con los m³ facturados.</w:t>
+        <w:t>Los meses previos a septiembre 2026 se midieron en el gráfico de la boleta. El rojo de la barra es el sobreconsumo del período punta. La diferencia en pesos es solo el recargo de agua potable de ese exceso, $1.131,92 por m³, valorizado a la tarifa del 11-05-2026.</w:t>
       </w:r>
     </w:p>
     <w:p>

</xml_diff>